<commit_message>
navbar mes o menys feta
</commit_message>
<xml_diff>
--- a/temporal/descripcionsDcoumentacio.docx
+++ b/temporal/descripcionsDcoumentacio.docx
@@ -2726,7 +2726,7 @@
         </w:rPr>
         <w:t xml:space="preserve">out STA Services: </w:t>
       </w:r>
-      <w:hyperlink r:id="rId4" w:history="1">
+      <w:hyperlink r:id="rId5" w:history="1">
         <w:r>
           <w:rPr>
             <w:rStyle w:val="Hipervnculo"/>
@@ -4364,18 +4364,7 @@
           <w:szCs w:val="22"/>
           <w:lang w:val="en-US" w:eastAsia="en-US"/>
         </w:rPr>
-        <w:t>collect</w:t>
-      </w:r>
-      <w:bookmarkStart w:id="0" w:name="_GoBack"/>
-      <w:bookmarkEnd w:id="0"/>
-      <w:r>
-        <w:rPr>
-          <w:rFonts w:asciiTheme="minorHAnsi" w:eastAsiaTheme="minorHAnsi" w:hAnsiTheme="minorHAnsi" w:cstheme="minorBidi"/>
-          <w:sz w:val="22"/>
-          <w:szCs w:val="22"/>
-          <w:lang w:val="en-US" w:eastAsia="en-US"/>
-        </w:rPr>
-        <w:t>ion</w:t>
+        <w:t>collection</w:t>
       </w:r>
       <w:proofErr w:type="spellEnd"/>
       <w:r>
@@ -5508,7 +5497,99 @@
         <w:rPr>
           <w:lang w:val="en-US"/>
         </w:rPr>
-        <w:t xml:space="preserve">Explore an Item  </w:t>
+        <w:t>Obtain the data from an</w:t>
+      </w:r>
+      <w:r>
+        <w:rPr>
+          <w:lang w:val="en-US"/>
+        </w:rPr>
+        <w:t xml:space="preserve"> Item</w:t>
+      </w:r>
+      <w:r>
+        <w:rPr>
+          <w:lang w:val="en-US"/>
+        </w:rPr>
+        <w:t xml:space="preserve"> from a collection. This tool is needed to explore the data from the </w:t>
+      </w:r>
+      <w:proofErr w:type="gramStart"/>
+      <w:r>
+        <w:rPr>
+          <w:lang w:val="en-US"/>
+        </w:rPr>
+        <w:t>item</w:t>
+      </w:r>
+      <w:r>
+        <w:rPr>
+          <w:lang w:val="en-US"/>
+        </w:rPr>
+        <w:t>,</w:t>
+      </w:r>
+      <w:proofErr w:type="gramEnd"/>
+      <w:r>
+        <w:rPr>
+          <w:lang w:val="en-US"/>
+        </w:rPr>
+        <w:t xml:space="preserve"> otherwise </w:t>
+      </w:r>
+      <w:proofErr w:type="spellStart"/>
+      <w:r>
+        <w:rPr>
+          <w:lang w:val="en-US"/>
+        </w:rPr>
+        <w:t>acces</w:t>
+      </w:r>
+      <w:proofErr w:type="spellEnd"/>
+      <w:r>
+        <w:rPr>
+          <w:lang w:val="en-US"/>
+        </w:rPr>
+        <w:t xml:space="preserve"> to </w:t>
+      </w:r>
+      <w:proofErr w:type="spellStart"/>
+      <w:r>
+        <w:rPr>
+          <w:lang w:val="en-US"/>
+        </w:rPr>
+        <w:t>json</w:t>
+      </w:r>
+      <w:proofErr w:type="spellEnd"/>
+      <w:r>
+        <w:rPr>
+          <w:lang w:val="en-US"/>
+        </w:rPr>
+        <w:t xml:space="preserve"> data</w:t>
+      </w:r>
+      <w:r>
+        <w:rPr>
+          <w:lang w:val="en-US"/>
+        </w:rPr>
+        <w:t xml:space="preserve"> (in </w:t>
+      </w:r>
+      <w:proofErr w:type="spellStart"/>
+      <w:r>
+        <w:rPr>
+          <w:lang w:val="en-US"/>
+        </w:rPr>
+        <w:t>itemsLikn</w:t>
+      </w:r>
+      <w:proofErr w:type="spellEnd"/>
+      <w:r>
+        <w:rPr>
+          <w:lang w:val="en-US"/>
+        </w:rPr>
+        <w:t>)</w:t>
+      </w:r>
+      <w:r>
+        <w:rPr>
+          <w:lang w:val="en-US"/>
+        </w:rPr>
+        <w:t xml:space="preserve"> directly in TAPIS is not </w:t>
+      </w:r>
+      <w:r>
+        <w:rPr>
+          <w:lang w:val="en-US"/>
+        </w:rPr>
+        <w:t>possible.</w:t>
       </w:r>
     </w:p>
     <w:p>
@@ -5517,13 +5598,281 @@
           <w:lang w:val="en-US"/>
         </w:rPr>
       </w:pPr>
+      <w:r>
+        <w:rPr>
+          <w:lang w:val="en-US"/>
+        </w:rPr>
+        <w:t xml:space="preserve">To use this tool you have </w:t>
+      </w:r>
+      <w:proofErr w:type="gramStart"/>
+      <w:r>
+        <w:rPr>
+          <w:lang w:val="en-US"/>
+        </w:rPr>
+        <w:t>3</w:t>
+      </w:r>
+      <w:proofErr w:type="gramEnd"/>
+      <w:r>
+        <w:rPr>
+          <w:lang w:val="en-US"/>
+        </w:rPr>
+        <w:t xml:space="preserve"> ways. </w:t>
+      </w:r>
     </w:p>
     <w:p>
       <w:pPr>
+        <w:pStyle w:val="Prrafodelista"/>
+        <w:numPr>
+          <w:ilvl w:val="0"/>
+          <w:numId w:val="1"/>
+        </w:numPr>
         <w:rPr>
           <w:lang w:val="en-US"/>
         </w:rPr>
       </w:pPr>
+      <w:r>
+        <w:rPr>
+          <w:lang w:val="en-US"/>
+        </w:rPr>
+        <w:t xml:space="preserve">Click directly in the collection link </w:t>
+      </w:r>
+      <w:proofErr w:type="spellStart"/>
+      <w:r>
+        <w:rPr>
+          <w:lang w:val="en-US"/>
+        </w:rPr>
+        <w:t>itemsLink</w:t>
+      </w:r>
+      <w:proofErr w:type="spellEnd"/>
+      <w:r>
+        <w:rPr>
+          <w:lang w:val="en-US"/>
+        </w:rPr>
+        <w:t xml:space="preserve">, this will display the select resource tool and the </w:t>
+      </w:r>
+      <w:proofErr w:type="spellStart"/>
+      <w:r>
+        <w:rPr>
+          <w:lang w:val="en-US"/>
+        </w:rPr>
+        <w:t>OAPIItems</w:t>
+      </w:r>
+      <w:proofErr w:type="spellEnd"/>
+      <w:r>
+        <w:rPr>
+          <w:lang w:val="en-US"/>
+        </w:rPr>
+        <w:t xml:space="preserve"> tool and data will be loaded automatically. </w:t>
+      </w:r>
+    </w:p>
+    <w:p>
+      <w:pPr>
+        <w:pStyle w:val="Prrafodelista"/>
+        <w:numPr>
+          <w:ilvl w:val="0"/>
+          <w:numId w:val="1"/>
+        </w:numPr>
+        <w:rPr>
+          <w:lang w:val="en-US"/>
+        </w:rPr>
+      </w:pPr>
+      <w:r>
+        <w:rPr>
+          <w:lang w:val="en-US"/>
+        </w:rPr>
+        <w:t xml:space="preserve">Same way as described before </w:t>
+      </w:r>
+      <w:proofErr w:type="gramStart"/>
+      <w:r>
+        <w:rPr>
+          <w:lang w:val="en-US"/>
+        </w:rPr>
+        <w:t>can be done</w:t>
+      </w:r>
+      <w:proofErr w:type="gramEnd"/>
+      <w:r>
+        <w:rPr>
+          <w:lang w:val="en-US"/>
+        </w:rPr>
+        <w:t xml:space="preserve"> manually, adding select resource tool </w:t>
+      </w:r>
+      <w:proofErr w:type="spellStart"/>
+      <w:r>
+        <w:rPr>
+          <w:lang w:val="en-US"/>
+        </w:rPr>
+        <w:t>followedby</w:t>
+      </w:r>
+      <w:proofErr w:type="spellEnd"/>
+      <w:r>
+        <w:rPr>
+          <w:lang w:val="en-US"/>
+        </w:rPr>
+        <w:t xml:space="preserve"> </w:t>
+      </w:r>
+      <w:proofErr w:type="spellStart"/>
+      <w:r>
+        <w:rPr>
+          <w:lang w:val="en-US"/>
+        </w:rPr>
+        <w:t>OAPIItems</w:t>
+      </w:r>
+      <w:proofErr w:type="spellEnd"/>
+      <w:r>
+        <w:rPr>
+          <w:lang w:val="en-US"/>
+        </w:rPr>
+        <w:t xml:space="preserve"> tool.</w:t>
+      </w:r>
+    </w:p>
+    <w:p>
+      <w:pPr>
+        <w:pStyle w:val="Prrafodelista"/>
+        <w:numPr>
+          <w:ilvl w:val="0"/>
+          <w:numId w:val="1"/>
+        </w:numPr>
+        <w:rPr>
+          <w:lang w:val="en-US"/>
+        </w:rPr>
+      </w:pPr>
+      <w:r>
+        <w:rPr>
+          <w:lang w:val="en-US"/>
+        </w:rPr>
+        <w:t xml:space="preserve">Linking blue select rows from </w:t>
+      </w:r>
+      <w:proofErr w:type="gramStart"/>
+      <w:r>
+        <w:rPr>
+          <w:lang w:val="en-US"/>
+        </w:rPr>
+        <w:t>a</w:t>
+      </w:r>
+      <w:proofErr w:type="gramEnd"/>
+      <w:r>
+        <w:rPr>
+          <w:lang w:val="en-US"/>
+        </w:rPr>
+        <w:t xml:space="preserve"> </w:t>
+      </w:r>
+      <w:proofErr w:type="spellStart"/>
+      <w:r>
+        <w:rPr>
+          <w:lang w:val="en-US"/>
+        </w:rPr>
+        <w:t>OAPIcollections</w:t>
+      </w:r>
+      <w:proofErr w:type="spellEnd"/>
+      <w:r>
+        <w:rPr>
+          <w:lang w:val="en-US"/>
+        </w:rPr>
+        <w:t xml:space="preserve">, selecting one collection and </w:t>
+      </w:r>
+      <w:proofErr w:type="spellStart"/>
+      <w:r>
+        <w:rPr>
+          <w:lang w:val="en-US"/>
+        </w:rPr>
+        <w:t>linkinb</w:t>
+      </w:r>
+      <w:proofErr w:type="spellEnd"/>
+      <w:r>
+        <w:rPr>
+          <w:lang w:val="en-US"/>
+        </w:rPr>
+        <w:t xml:space="preserve"> after the OAPIITEMS tool. </w:t>
+      </w:r>
+    </w:p>
+    <w:p>
+      <w:pPr>
+        <w:rPr>
+          <w:lang w:val="en-US"/>
+        </w:rPr>
+      </w:pPr>
+      <w:r>
+        <w:rPr>
+          <w:lang w:val="en-US"/>
+        </w:rPr>
+        <w:t xml:space="preserve">If you </w:t>
+      </w:r>
+      <w:proofErr w:type="gramStart"/>
+      <w:r>
+        <w:rPr>
+          <w:lang w:val="en-US"/>
+        </w:rPr>
+        <w:t>know</w:t>
+      </w:r>
+      <w:proofErr w:type="gramEnd"/>
+      <w:r>
+        <w:rPr>
+          <w:lang w:val="en-US"/>
+        </w:rPr>
+        <w:t xml:space="preserve"> the URL</w:t>
+      </w:r>
+      <w:r>
+        <w:rPr>
+          <w:lang w:val="en-US"/>
+        </w:rPr>
+        <w:t xml:space="preserve"> from this ITEM this can be pasted or written directly in </w:t>
+      </w:r>
+      <w:r>
+        <w:rPr>
+          <w:lang w:val="en-US"/>
+        </w:rPr>
+        <w:t>Landing page URL</w:t>
+      </w:r>
+      <w:r>
+        <w:rPr>
+          <w:lang w:val="en-US"/>
+        </w:rPr>
+        <w:t xml:space="preserve">. In this case, dropdown </w:t>
+      </w:r>
+      <w:proofErr w:type="gramStart"/>
+      <w:r>
+        <w:rPr>
+          <w:lang w:val="en-US"/>
+        </w:rPr>
+        <w:t>hasn’t got</w:t>
+      </w:r>
+      <w:proofErr w:type="gramEnd"/>
+      <w:r>
+        <w:rPr>
+          <w:lang w:val="en-US"/>
+        </w:rPr>
+        <w:t xml:space="preserve"> suggestions. For suggestions, use </w:t>
+      </w:r>
+      <w:proofErr w:type="spellStart"/>
+      <w:proofErr w:type="gramStart"/>
+      <w:r>
+        <w:rPr>
+          <w:lang w:val="en-US"/>
+        </w:rPr>
+        <w:t>OAPIcollections</w:t>
+      </w:r>
+      <w:proofErr w:type="spellEnd"/>
+      <w:r>
+        <w:rPr>
+          <w:lang w:val="en-US"/>
+        </w:rPr>
+        <w:t xml:space="preserve">  </w:t>
+      </w:r>
+      <w:proofErr w:type="spellStart"/>
+      <w:r>
+        <w:rPr>
+          <w:lang w:val="en-US"/>
+        </w:rPr>
+        <w:t>sugestions</w:t>
+      </w:r>
+      <w:proofErr w:type="spellEnd"/>
+      <w:proofErr w:type="gramEnd"/>
+      <w:r>
+        <w:rPr>
+          <w:lang w:val="en-US"/>
+        </w:rPr>
+        <w:t xml:space="preserve"> and select an item. </w:t>
+      </w:r>
     </w:p>
     <w:p>
       <w:pPr>
@@ -5542,112 +5891,25 @@
           <w:szCs w:val="22"/>
           <w:lang w:val="en-US" w:eastAsia="en-US"/>
         </w:rPr>
-        <w:t>Connects to the collections page of an OGC Web API instance</w:t>
-      </w:r>
-      <w:r>
-        <w:rPr>
-          <w:rFonts w:asciiTheme="minorHAnsi" w:eastAsiaTheme="minorHAnsi" w:hAnsiTheme="minorHAnsi" w:cstheme="minorBidi"/>
-          <w:sz w:val="22"/>
-          <w:szCs w:val="22"/>
-          <w:lang w:val="en-US" w:eastAsia="en-US"/>
-        </w:rPr>
-        <w:t xml:space="preserve"> and downloads the data to the browser. This data </w:t>
-      </w:r>
-      <w:proofErr w:type="gramStart"/>
-      <w:r>
-        <w:rPr>
-          <w:rFonts w:asciiTheme="minorHAnsi" w:eastAsiaTheme="minorHAnsi" w:hAnsiTheme="minorHAnsi" w:cstheme="minorBidi"/>
-          <w:sz w:val="22"/>
-          <w:szCs w:val="22"/>
-          <w:lang w:val="en-US" w:eastAsia="en-US"/>
-        </w:rPr>
-        <w:t>will be displayed</w:t>
-      </w:r>
-      <w:proofErr w:type="gramEnd"/>
-      <w:r>
-        <w:rPr>
-          <w:rFonts w:asciiTheme="minorHAnsi" w:eastAsiaTheme="minorHAnsi" w:hAnsiTheme="minorHAnsi" w:cstheme="minorBidi"/>
-          <w:sz w:val="22"/>
-          <w:szCs w:val="22"/>
-          <w:lang w:val="en-US" w:eastAsia="en-US"/>
-        </w:rPr>
-        <w:t xml:space="preserve"> as a table. When an </w:t>
-      </w:r>
-      <w:r>
-        <w:rPr>
-          <w:rFonts w:asciiTheme="minorHAnsi" w:eastAsiaTheme="minorHAnsi" w:hAnsiTheme="minorHAnsi" w:cstheme="minorBidi"/>
-          <w:sz w:val="22"/>
-          <w:szCs w:val="22"/>
-          <w:lang w:val="en-US" w:eastAsia="en-US"/>
-        </w:rPr>
-        <w:t xml:space="preserve">OAPI </w:t>
-      </w:r>
-      <w:proofErr w:type="gramStart"/>
-      <w:r>
-        <w:rPr>
-          <w:rFonts w:asciiTheme="minorHAnsi" w:eastAsiaTheme="minorHAnsi" w:hAnsiTheme="minorHAnsi" w:cstheme="minorBidi"/>
-          <w:sz w:val="22"/>
-          <w:szCs w:val="22"/>
-          <w:lang w:val="en-US" w:eastAsia="en-US"/>
-        </w:rPr>
-        <w:t>collections</w:t>
-      </w:r>
-      <w:proofErr w:type="gramEnd"/>
-      <w:r>
-        <w:rPr>
-          <w:rFonts w:asciiTheme="minorHAnsi" w:eastAsiaTheme="minorHAnsi" w:hAnsiTheme="minorHAnsi" w:cstheme="minorBidi"/>
-          <w:sz w:val="22"/>
-          <w:szCs w:val="22"/>
-          <w:lang w:val="en-US" w:eastAsia="en-US"/>
-        </w:rPr>
-        <w:t xml:space="preserve"> is used, data will be loaded at every step. Using the </w:t>
-      </w:r>
-      <w:r>
-        <w:rPr>
-          <w:rFonts w:asciiTheme="minorHAnsi" w:eastAsiaTheme="minorHAnsi" w:hAnsiTheme="minorHAnsi" w:cstheme="minorBidi"/>
-          <w:i/>
-          <w:sz w:val="22"/>
-          <w:szCs w:val="22"/>
-          <w:lang w:val="en-US" w:eastAsia="en-US"/>
-        </w:rPr>
-        <w:t>blue tools</w:t>
-      </w:r>
-      <w:r>
-        <w:rPr>
-          <w:rFonts w:asciiTheme="minorHAnsi" w:eastAsiaTheme="minorHAnsi" w:hAnsiTheme="minorHAnsi" w:cstheme="minorBidi"/>
-          <w:sz w:val="22"/>
-          <w:szCs w:val="22"/>
-          <w:lang w:val="en-US" w:eastAsia="en-US"/>
-        </w:rPr>
-        <w:t xml:space="preserve"> will make a new request to the API, while using the </w:t>
-      </w:r>
-      <w:r>
-        <w:rPr>
-          <w:rFonts w:asciiTheme="minorHAnsi" w:eastAsiaTheme="minorHAnsi" w:hAnsiTheme="minorHAnsi" w:cstheme="minorBidi"/>
-          <w:i/>
-          <w:sz w:val="22"/>
-          <w:szCs w:val="22"/>
-          <w:lang w:val="en-US" w:eastAsia="en-US"/>
-        </w:rPr>
-        <w:t>grey tools</w:t>
-      </w:r>
-      <w:r>
-        <w:rPr>
-          <w:rFonts w:asciiTheme="minorHAnsi" w:eastAsiaTheme="minorHAnsi" w:hAnsiTheme="minorHAnsi" w:cstheme="minorBidi"/>
-          <w:sz w:val="22"/>
-          <w:szCs w:val="22"/>
-          <w:lang w:val="en-US" w:eastAsia="en-US"/>
-        </w:rPr>
-        <w:t xml:space="preserve"> will work with the data already stored in the browser.</w:t>
-      </w:r>
-      <w:r>
-        <w:rPr>
-          <w:rFonts w:asciiTheme="minorHAnsi" w:eastAsiaTheme="minorHAnsi" w:hAnsiTheme="minorHAnsi" w:cstheme="minorBidi"/>
-          <w:sz w:val="22"/>
-          <w:szCs w:val="22"/>
-          <w:lang w:val="en-US" w:eastAsia="en-US"/>
-        </w:rPr>
-        <w:t xml:space="preserve"> Caution, not all collections have all actions, for example filter. When a blue filter tool </w:t>
+        <w:t xml:space="preserve">Caution, not all </w:t>
+      </w:r>
+      <w:r>
+        <w:rPr>
+          <w:rFonts w:asciiTheme="minorHAnsi" w:eastAsiaTheme="minorHAnsi" w:hAnsiTheme="minorHAnsi" w:cstheme="minorBidi"/>
+          <w:sz w:val="22"/>
+          <w:szCs w:val="22"/>
+          <w:lang w:val="en-US" w:eastAsia="en-US"/>
+        </w:rPr>
+        <w:t>items</w:t>
+      </w:r>
+      <w:r>
+        <w:rPr>
+          <w:rFonts w:asciiTheme="minorHAnsi" w:eastAsiaTheme="minorHAnsi" w:hAnsiTheme="minorHAnsi" w:cstheme="minorBidi"/>
+          <w:sz w:val="22"/>
+          <w:szCs w:val="22"/>
+          <w:lang w:val="en-US" w:eastAsia="en-US"/>
+        </w:rPr>
+        <w:t xml:space="preserve"> have all actions, for example filter. When a blue filter tool </w:t>
       </w:r>
       <w:proofErr w:type="gramStart"/>
       <w:r>
@@ -5706,7 +5968,16 @@
           <w:szCs w:val="22"/>
           <w:lang w:val="en-US" w:eastAsia="en-US"/>
         </w:rPr>
-        <w:t xml:space="preserve">collections </w:t>
+        <w:t>items</w:t>
+      </w:r>
+      <w:r>
+        <w:rPr>
+          <w:rFonts w:asciiTheme="minorHAnsi" w:eastAsiaTheme="minorHAnsi" w:hAnsiTheme="minorHAnsi" w:cstheme="minorBidi"/>
+          <w:sz w:val="22"/>
+          <w:szCs w:val="22"/>
+          <w:lang w:val="en-US" w:eastAsia="en-US"/>
+        </w:rPr>
+        <w:t xml:space="preserve"> </w:t>
       </w:r>
       <w:r>
         <w:rPr>
@@ -5812,84 +6083,68 @@
           <w:szCs w:val="22"/>
           <w:lang w:val="en-US" w:eastAsia="en-US"/>
         </w:rPr>
-        <w:t xml:space="preserve">To access </w:t>
-      </w:r>
-      <w:r>
-        <w:rPr>
-          <w:rFonts w:asciiTheme="minorHAnsi" w:eastAsiaTheme="minorHAnsi" w:hAnsiTheme="minorHAnsi" w:cstheme="minorBidi"/>
-          <w:sz w:val="22"/>
-          <w:szCs w:val="22"/>
-          <w:lang w:val="en-US" w:eastAsia="en-US"/>
-        </w:rPr>
-        <w:t xml:space="preserve">to </w:t>
-      </w:r>
-      <w:r>
-        <w:rPr>
-          <w:rFonts w:asciiTheme="minorHAnsi" w:eastAsiaTheme="minorHAnsi" w:hAnsiTheme="minorHAnsi" w:cstheme="minorBidi"/>
-          <w:sz w:val="22"/>
-          <w:szCs w:val="22"/>
-          <w:lang w:val="en-US" w:eastAsia="en-US"/>
-        </w:rPr>
-        <w:t xml:space="preserve">a service, the service URL </w:t>
-      </w:r>
-      <w:proofErr w:type="gramStart"/>
-      <w:r>
-        <w:rPr>
-          <w:rFonts w:asciiTheme="minorHAnsi" w:eastAsiaTheme="minorHAnsi" w:hAnsiTheme="minorHAnsi" w:cstheme="minorBidi"/>
-          <w:sz w:val="22"/>
-          <w:szCs w:val="22"/>
-          <w:lang w:val="en-US" w:eastAsia="en-US"/>
-        </w:rPr>
-        <w:t>should be placed</w:t>
-      </w:r>
-      <w:proofErr w:type="gramEnd"/>
-      <w:r>
-        <w:rPr>
-          <w:rFonts w:asciiTheme="minorHAnsi" w:eastAsiaTheme="minorHAnsi" w:hAnsiTheme="minorHAnsi" w:cstheme="minorBidi"/>
-          <w:sz w:val="22"/>
-          <w:szCs w:val="22"/>
-          <w:lang w:val="en-US" w:eastAsia="en-US"/>
-        </w:rPr>
-        <w:t xml:space="preserve"> in the </w:t>
+        <w:lastRenderedPageBreak/>
+        <w:t xml:space="preserve">Click the </w:t>
       </w:r>
       <w:r>
         <w:rPr>
           <w:rFonts w:asciiTheme="minorHAnsi" w:eastAsiaTheme="minorHAnsi" w:hAnsiTheme="minorHAnsi" w:cstheme="minorBidi"/>
           <w:b/>
-          <w:sz w:val="22"/>
-          <w:szCs w:val="22"/>
-          <w:lang w:val="en-US" w:eastAsia="en-US"/>
-        </w:rPr>
-        <w:t>Landing Page URL field</w:t>
-      </w:r>
-      <w:r>
-        <w:rPr>
-          <w:rFonts w:asciiTheme="minorHAnsi" w:eastAsiaTheme="minorHAnsi" w:hAnsiTheme="minorHAnsi" w:cstheme="minorBidi"/>
-          <w:sz w:val="22"/>
-          <w:szCs w:val="22"/>
-          <w:lang w:val="en-US" w:eastAsia="en-US"/>
-        </w:rPr>
-        <w:t xml:space="preserve">. TAPIS provides several examples in the dropdown below; select one and the URL </w:t>
-      </w:r>
-      <w:proofErr w:type="gramStart"/>
-      <w:r>
-        <w:rPr>
-          <w:rFonts w:asciiTheme="minorHAnsi" w:eastAsiaTheme="minorHAnsi" w:hAnsiTheme="minorHAnsi" w:cstheme="minorBidi"/>
-          <w:sz w:val="22"/>
-          <w:szCs w:val="22"/>
-          <w:lang w:val="en-US" w:eastAsia="en-US"/>
-        </w:rPr>
-        <w:t>will be added</w:t>
-      </w:r>
-      <w:proofErr w:type="gramEnd"/>
-      <w:r>
-        <w:rPr>
-          <w:rFonts w:asciiTheme="minorHAnsi" w:eastAsiaTheme="minorHAnsi" w:hAnsiTheme="minorHAnsi" w:cstheme="minorBidi"/>
-          <w:sz w:val="22"/>
-          <w:szCs w:val="22"/>
-          <w:lang w:val="en-US" w:eastAsia="en-US"/>
-        </w:rPr>
-        <w:t xml:space="preserve"> automatically.</w:t>
+          <w:bCs/>
+          <w:sz w:val="22"/>
+          <w:szCs w:val="22"/>
+          <w:lang w:val="en-US" w:eastAsia="en-US"/>
+        </w:rPr>
+        <w:t>OK</w:t>
+      </w:r>
+      <w:r>
+        <w:rPr>
+          <w:rFonts w:asciiTheme="minorHAnsi" w:eastAsiaTheme="minorHAnsi" w:hAnsiTheme="minorHAnsi" w:cstheme="minorBidi"/>
+          <w:sz w:val="22"/>
+          <w:szCs w:val="22"/>
+          <w:lang w:val="en-US" w:eastAsia="en-US"/>
+        </w:rPr>
+        <w:t xml:space="preserve"> button to load the data. If the action succeeds, </w:t>
+      </w:r>
+      <w:r>
+        <w:rPr>
+          <w:rFonts w:asciiTheme="minorHAnsi" w:eastAsiaTheme="minorHAnsi" w:hAnsiTheme="minorHAnsi" w:cstheme="minorBidi"/>
+          <w:b/>
+          <w:bCs/>
+          <w:sz w:val="22"/>
+          <w:szCs w:val="22"/>
+          <w:lang w:val="en-US" w:eastAsia="en-US"/>
+        </w:rPr>
+        <w:t>“Complete”</w:t>
+      </w:r>
+      <w:r>
+        <w:rPr>
+          <w:rFonts w:asciiTheme="minorHAnsi" w:eastAsiaTheme="minorHAnsi" w:hAnsiTheme="minorHAnsi" w:cstheme="minorBidi"/>
+          <w:sz w:val="22"/>
+          <w:szCs w:val="22"/>
+          <w:lang w:val="en-US" w:eastAsia="en-US"/>
+        </w:rPr>
+        <w:t xml:space="preserve"> will appear in the clarification zone (the box on the right). If the action fails, the error will appear in this box—for example: </w:t>
+      </w:r>
+      <w:r>
+        <w:rPr>
+          <w:rFonts w:asciiTheme="minorHAnsi" w:eastAsiaTheme="minorHAnsi" w:hAnsiTheme="minorHAnsi" w:cstheme="minorBidi"/>
+          <w:i/>
+          <w:iCs/>
+          <w:sz w:val="22"/>
+          <w:szCs w:val="22"/>
+          <w:lang w:val="en-US" w:eastAsia="en-US"/>
+        </w:rPr>
+        <w:t>HTTP Response Code: 401</w:t>
+      </w:r>
+      <w:r>
+        <w:rPr>
+          <w:rFonts w:asciiTheme="minorHAnsi" w:eastAsiaTheme="minorHAnsi" w:hAnsiTheme="minorHAnsi" w:cstheme="minorBidi"/>
+          <w:sz w:val="22"/>
+          <w:szCs w:val="22"/>
+          <w:lang w:val="en-US" w:eastAsia="en-US"/>
+        </w:rPr>
+        <w:t>, indicating that authorization is required.</w:t>
       </w:r>
     </w:p>
     <w:p>
@@ -5909,156 +6164,85 @@
           <w:szCs w:val="22"/>
           <w:lang w:val="en-US" w:eastAsia="en-US"/>
         </w:rPr>
-        <w:t xml:space="preserve">Click the </w:t>
-      </w:r>
-      <w:r>
-        <w:rPr>
-          <w:rFonts w:asciiTheme="minorHAnsi" w:eastAsiaTheme="minorHAnsi" w:hAnsiTheme="minorHAnsi" w:cstheme="minorBidi"/>
-          <w:b/>
-          <w:bCs/>
-          <w:sz w:val="22"/>
-          <w:szCs w:val="22"/>
-          <w:lang w:val="en-US" w:eastAsia="en-US"/>
-        </w:rPr>
-        <w:t>OK</w:t>
-      </w:r>
-      <w:r>
-        <w:rPr>
-          <w:rFonts w:asciiTheme="minorHAnsi" w:eastAsiaTheme="minorHAnsi" w:hAnsiTheme="minorHAnsi" w:cstheme="minorBidi"/>
-          <w:sz w:val="22"/>
-          <w:szCs w:val="22"/>
-          <w:lang w:val="en-US" w:eastAsia="en-US"/>
-        </w:rPr>
-        <w:t xml:space="preserve"> button to load the data. If the action succeeds, </w:t>
-      </w:r>
-      <w:r>
-        <w:rPr>
-          <w:rFonts w:asciiTheme="minorHAnsi" w:eastAsiaTheme="minorHAnsi" w:hAnsiTheme="minorHAnsi" w:cstheme="minorBidi"/>
-          <w:b/>
-          <w:bCs/>
-          <w:sz w:val="22"/>
-          <w:szCs w:val="22"/>
-          <w:lang w:val="en-US" w:eastAsia="en-US"/>
-        </w:rPr>
-        <w:t>“Complete”</w:t>
-      </w:r>
-      <w:r>
-        <w:rPr>
-          <w:rFonts w:asciiTheme="minorHAnsi" w:eastAsiaTheme="minorHAnsi" w:hAnsiTheme="minorHAnsi" w:cstheme="minorBidi"/>
-          <w:sz w:val="22"/>
-          <w:szCs w:val="22"/>
-          <w:lang w:val="en-US" w:eastAsia="en-US"/>
-        </w:rPr>
-        <w:t xml:space="preserve"> will appear in the clarification zone (the box on the right). If the action fails, the error will appear in this box—for example: </w:t>
-      </w:r>
-      <w:r>
-        <w:rPr>
-          <w:rFonts w:asciiTheme="minorHAnsi" w:eastAsiaTheme="minorHAnsi" w:hAnsiTheme="minorHAnsi" w:cstheme="minorBidi"/>
-          <w:i/>
-          <w:iCs/>
-          <w:sz w:val="22"/>
-          <w:szCs w:val="22"/>
-          <w:lang w:val="en-US" w:eastAsia="en-US"/>
-        </w:rPr>
-        <w:t>HTTP Response Code: 401</w:t>
-      </w:r>
-      <w:r>
-        <w:rPr>
-          <w:rFonts w:asciiTheme="minorHAnsi" w:eastAsiaTheme="minorHAnsi" w:hAnsiTheme="minorHAnsi" w:cstheme="minorBidi"/>
-          <w:sz w:val="22"/>
-          <w:szCs w:val="22"/>
-          <w:lang w:val="en-US" w:eastAsia="en-US"/>
-        </w:rPr>
-        <w:t>, indicating that authorization is required.</w:t>
+        <w:t xml:space="preserve">A successful result will be </w:t>
+      </w:r>
+      <w:r>
+        <w:rPr>
+          <w:rFonts w:asciiTheme="minorHAnsi" w:eastAsiaTheme="minorHAnsi" w:hAnsiTheme="minorHAnsi" w:cstheme="minorBidi"/>
+          <w:sz w:val="22"/>
+          <w:szCs w:val="22"/>
+          <w:lang w:val="en-US" w:eastAsia="en-US"/>
+        </w:rPr>
+        <w:t xml:space="preserve">a table with the </w:t>
+      </w:r>
+      <w:r>
+        <w:rPr>
+          <w:rFonts w:asciiTheme="minorHAnsi" w:eastAsiaTheme="minorHAnsi" w:hAnsiTheme="minorHAnsi" w:cstheme="minorBidi"/>
+          <w:sz w:val="22"/>
+          <w:szCs w:val="22"/>
+          <w:lang w:val="en-US" w:eastAsia="en-US"/>
+        </w:rPr>
+        <w:t>data</w:t>
+      </w:r>
+      <w:r>
+        <w:rPr>
+          <w:rFonts w:asciiTheme="minorHAnsi" w:eastAsiaTheme="minorHAnsi" w:hAnsiTheme="minorHAnsi" w:cstheme="minorBidi"/>
+          <w:sz w:val="22"/>
+          <w:szCs w:val="22"/>
+          <w:lang w:val="en-US" w:eastAsia="en-US"/>
+        </w:rPr>
+        <w:t xml:space="preserve"> </w:t>
+      </w:r>
+      <w:proofErr w:type="spellStart"/>
+      <w:r>
+        <w:rPr>
+          <w:rFonts w:asciiTheme="minorHAnsi" w:eastAsiaTheme="minorHAnsi" w:hAnsiTheme="minorHAnsi" w:cstheme="minorBidi"/>
+          <w:sz w:val="22"/>
+          <w:szCs w:val="22"/>
+          <w:lang w:val="en-US" w:eastAsia="en-US"/>
+        </w:rPr>
+        <w:t>suported</w:t>
+      </w:r>
+      <w:proofErr w:type="spellEnd"/>
+      <w:r>
+        <w:rPr>
+          <w:rFonts w:asciiTheme="minorHAnsi" w:eastAsiaTheme="minorHAnsi" w:hAnsiTheme="minorHAnsi" w:cstheme="minorBidi"/>
+          <w:sz w:val="22"/>
+          <w:szCs w:val="22"/>
+          <w:lang w:val="en-US" w:eastAsia="en-US"/>
+        </w:rPr>
+        <w:t xml:space="preserve"> by </w:t>
+      </w:r>
+      <w:r>
+        <w:rPr>
+          <w:rFonts w:asciiTheme="minorHAnsi" w:eastAsiaTheme="minorHAnsi" w:hAnsiTheme="minorHAnsi" w:cstheme="minorBidi"/>
+          <w:sz w:val="22"/>
+          <w:szCs w:val="22"/>
+          <w:lang w:val="en-US" w:eastAsia="en-US"/>
+        </w:rPr>
+        <w:t>item selected</w:t>
+      </w:r>
+      <w:r>
+        <w:rPr>
+          <w:rFonts w:asciiTheme="minorHAnsi" w:eastAsiaTheme="minorHAnsi" w:hAnsiTheme="minorHAnsi" w:cstheme="minorBidi"/>
+          <w:sz w:val="22"/>
+          <w:szCs w:val="22"/>
+          <w:lang w:val="en-US" w:eastAsia="en-US"/>
+        </w:rPr>
+        <w:t xml:space="preserve">. </w:t>
       </w:r>
     </w:p>
     <w:p>
       <w:pPr>
-        <w:pStyle w:val="NormalWeb"/>
-        <w:rPr>
-          <w:rFonts w:asciiTheme="minorHAnsi" w:eastAsiaTheme="minorHAnsi" w:hAnsiTheme="minorHAnsi" w:cstheme="minorBidi"/>
-          <w:sz w:val="22"/>
-          <w:szCs w:val="22"/>
-          <w:lang w:val="en-US" w:eastAsia="en-US"/>
+        <w:rPr>
+          <w:u w:val="single"/>
+          <w:lang w:val="en-US"/>
         </w:rPr>
       </w:pPr>
       <w:r>
         <w:rPr>
-          <w:rFonts w:asciiTheme="minorHAnsi" w:eastAsiaTheme="minorHAnsi" w:hAnsiTheme="minorHAnsi" w:cstheme="minorBidi"/>
-          <w:sz w:val="22"/>
-          <w:szCs w:val="22"/>
-          <w:lang w:val="en-US" w:eastAsia="en-US"/>
-        </w:rPr>
-        <w:t xml:space="preserve">A successful result will be </w:t>
-      </w:r>
-      <w:r>
-        <w:rPr>
-          <w:rFonts w:asciiTheme="minorHAnsi" w:eastAsiaTheme="minorHAnsi" w:hAnsiTheme="minorHAnsi" w:cstheme="minorBidi"/>
-          <w:sz w:val="22"/>
-          <w:szCs w:val="22"/>
-          <w:lang w:val="en-US" w:eastAsia="en-US"/>
-        </w:rPr>
-        <w:t xml:space="preserve">a table with the list of </w:t>
-      </w:r>
-      <w:r>
-        <w:rPr>
-          <w:rFonts w:asciiTheme="minorHAnsi" w:eastAsiaTheme="minorHAnsi" w:hAnsiTheme="minorHAnsi" w:cstheme="minorBidi"/>
-          <w:sz w:val="22"/>
-          <w:szCs w:val="22"/>
-          <w:lang w:val="en-US" w:eastAsia="en-US"/>
-        </w:rPr>
-        <w:t>collections</w:t>
-      </w:r>
-      <w:r>
-        <w:rPr>
-          <w:rFonts w:asciiTheme="minorHAnsi" w:eastAsiaTheme="minorHAnsi" w:hAnsiTheme="minorHAnsi" w:cstheme="minorBidi"/>
-          <w:sz w:val="22"/>
-          <w:szCs w:val="22"/>
-          <w:lang w:val="en-US" w:eastAsia="en-US"/>
-        </w:rPr>
-        <w:t xml:space="preserve"> </w:t>
-      </w:r>
-      <w:proofErr w:type="spellStart"/>
-      <w:r>
-        <w:rPr>
-          <w:rFonts w:asciiTheme="minorHAnsi" w:eastAsiaTheme="minorHAnsi" w:hAnsiTheme="minorHAnsi" w:cstheme="minorBidi"/>
-          <w:sz w:val="22"/>
-          <w:szCs w:val="22"/>
-          <w:lang w:val="en-US" w:eastAsia="en-US"/>
-        </w:rPr>
-        <w:t>suported</w:t>
-      </w:r>
-      <w:proofErr w:type="spellEnd"/>
-      <w:r>
-        <w:rPr>
-          <w:rFonts w:asciiTheme="minorHAnsi" w:eastAsiaTheme="minorHAnsi" w:hAnsiTheme="minorHAnsi" w:cstheme="minorBidi"/>
-          <w:sz w:val="22"/>
-          <w:szCs w:val="22"/>
-          <w:lang w:val="en-US" w:eastAsia="en-US"/>
-        </w:rPr>
-        <w:t xml:space="preserve"> by the </w:t>
-      </w:r>
-      <w:r>
-        <w:rPr>
-          <w:rFonts w:asciiTheme="minorHAnsi" w:eastAsiaTheme="minorHAnsi" w:hAnsiTheme="minorHAnsi" w:cstheme="minorBidi"/>
-          <w:sz w:val="22"/>
-          <w:szCs w:val="22"/>
-          <w:lang w:val="en-US" w:eastAsia="en-US"/>
-        </w:rPr>
-        <w:t xml:space="preserve">service. </w:t>
-      </w:r>
-    </w:p>
-    <w:p>
-      <w:pPr>
-        <w:rPr>
-          <w:lang w:val="en-US"/>
-        </w:rPr>
-      </w:pPr>
-      <w:r>
-        <w:rPr>
-          <w:lang w:val="en-US"/>
-        </w:rPr>
-        <w:lastRenderedPageBreak/>
+          <w:lang w:val="en-US"/>
+        </w:rPr>
         <w:t xml:space="preserve">More information </w:t>
       </w:r>
       <w:proofErr w:type="gramStart"/>
@@ -6075,12 +6259,23 @@
         </w:rPr>
         <w:t xml:space="preserve"> collections: </w:t>
       </w:r>
-      <w:r>
-        <w:rPr>
-          <w:lang w:val="en-US"/>
-        </w:rPr>
-        <w:t>https://ogcapi.ogc.org/features/overview.html</w:t>
-      </w:r>
+      <w:hyperlink r:id="rId6" w:history="1">
+        <w:r>
+          <w:rPr>
+            <w:rStyle w:val="Hipervnculo"/>
+            <w:lang w:val="en-US"/>
+          </w:rPr>
+          <w:t>https://ogcapi.ogc.org/features/overview.html</w:t>
+        </w:r>
+      </w:hyperlink>
+      <w:r>
+        <w:rPr>
+          <w:lang w:val="en-US"/>
+        </w:rPr>
+        <w:t xml:space="preserve"> (?)</w:t>
+      </w:r>
+      <w:bookmarkStart w:id="0" w:name="_GoBack"/>
+      <w:bookmarkEnd w:id="0"/>
     </w:p>
     <w:p>
       <w:pPr>
@@ -6097,6 +6292,126 @@
     </w:sectPr>
   </w:body>
 </w:document>
+</file>
+
+<file path=word/numbering.xml><?xml version="1.0" encoding="utf-8"?>
+<w:numbering xmlns:wpc="http://schemas.microsoft.com/office/word/2010/wordprocessingCanvas" xmlns:cx="http://schemas.microsoft.com/office/drawing/2014/chartex" xmlns:cx1="http://schemas.microsoft.com/office/drawing/2015/9/8/chartex" xmlns:mc="http://schemas.openxmlformats.org/markup-compatibility/2006" xmlns:o="urn:schemas-microsoft-com:office:office" xmlns:r="http://schemas.openxmlformats.org/officeDocument/2006/relationships" xmlns:m="http://schemas.openxmlformats.org/officeDocument/2006/math" xmlns:v="urn:schemas-microsoft-com:vml" xmlns:wp14="http://schemas.microsoft.com/office/word/2010/wordprocessingDrawing" xmlns:wp="http://schemas.openxmlformats.org/drawingml/2006/wordprocessingDrawing" xmlns:w10="urn:schemas-microsoft-com:office:word" xmlns:w="http://schemas.openxmlformats.org/wordprocessingml/2006/main" xmlns:w14="http://schemas.microsoft.com/office/word/2010/wordml" xmlns:w15="http://schemas.microsoft.com/office/word/2012/wordml" xmlns:w16se="http://schemas.microsoft.com/office/word/2015/wordml/symex" xmlns:wpg="http://schemas.microsoft.com/office/word/2010/wordprocessingGroup" xmlns:wpi="http://schemas.microsoft.com/office/word/2010/wordprocessingInk" xmlns:wne="http://schemas.microsoft.com/office/word/2006/wordml" xmlns:wps="http://schemas.microsoft.com/office/word/2010/wordprocessingShape" mc:Ignorable="w14 w15 w16se wp14">
+  <w:abstractNum w:abstractNumId="0" w15:restartNumberingAfterBreak="0">
+    <w:nsid w:val="03993F22"/>
+    <w:multiLevelType w:val="hybridMultilevel"/>
+    <w:tmpl w:val="765882F2"/>
+    <w:lvl w:ilvl="0" w:tplc="253486B0">
+      <w:numFmt w:val="bullet"/>
+      <w:lvlText w:val="-"/>
+      <w:lvlJc w:val="left"/>
+      <w:pPr>
+        <w:ind w:left="720" w:hanging="360"/>
+      </w:pPr>
+      <w:rPr>
+        <w:rFonts w:ascii="Calibri" w:eastAsiaTheme="minorHAnsi" w:hAnsi="Calibri" w:cs="Calibri" w:hint="default"/>
+      </w:rPr>
+    </w:lvl>
+    <w:lvl w:ilvl="1" w:tplc="0C0A0003" w:tentative="1">
+      <w:start w:val="1"/>
+      <w:numFmt w:val="bullet"/>
+      <w:lvlText w:val="o"/>
+      <w:lvlJc w:val="left"/>
+      <w:pPr>
+        <w:ind w:left="1440" w:hanging="360"/>
+      </w:pPr>
+      <w:rPr>
+        <w:rFonts w:ascii="Courier New" w:hAnsi="Courier New" w:cs="Courier New" w:hint="default"/>
+      </w:rPr>
+    </w:lvl>
+    <w:lvl w:ilvl="2" w:tplc="0C0A0005" w:tentative="1">
+      <w:start w:val="1"/>
+      <w:numFmt w:val="bullet"/>
+      <w:lvlText w:val=""/>
+      <w:lvlJc w:val="left"/>
+      <w:pPr>
+        <w:ind w:left="2160" w:hanging="360"/>
+      </w:pPr>
+      <w:rPr>
+        <w:rFonts w:ascii="Wingdings" w:hAnsi="Wingdings" w:hint="default"/>
+      </w:rPr>
+    </w:lvl>
+    <w:lvl w:ilvl="3" w:tplc="0C0A0001" w:tentative="1">
+      <w:start w:val="1"/>
+      <w:numFmt w:val="bullet"/>
+      <w:lvlText w:val=""/>
+      <w:lvlJc w:val="left"/>
+      <w:pPr>
+        <w:ind w:left="2880" w:hanging="360"/>
+      </w:pPr>
+      <w:rPr>
+        <w:rFonts w:ascii="Symbol" w:hAnsi="Symbol" w:hint="default"/>
+      </w:rPr>
+    </w:lvl>
+    <w:lvl w:ilvl="4" w:tplc="0C0A0003" w:tentative="1">
+      <w:start w:val="1"/>
+      <w:numFmt w:val="bullet"/>
+      <w:lvlText w:val="o"/>
+      <w:lvlJc w:val="left"/>
+      <w:pPr>
+        <w:ind w:left="3600" w:hanging="360"/>
+      </w:pPr>
+      <w:rPr>
+        <w:rFonts w:ascii="Courier New" w:hAnsi="Courier New" w:cs="Courier New" w:hint="default"/>
+      </w:rPr>
+    </w:lvl>
+    <w:lvl w:ilvl="5" w:tplc="0C0A0005" w:tentative="1">
+      <w:start w:val="1"/>
+      <w:numFmt w:val="bullet"/>
+      <w:lvlText w:val=""/>
+      <w:lvlJc w:val="left"/>
+      <w:pPr>
+        <w:ind w:left="4320" w:hanging="360"/>
+      </w:pPr>
+      <w:rPr>
+        <w:rFonts w:ascii="Wingdings" w:hAnsi="Wingdings" w:hint="default"/>
+      </w:rPr>
+    </w:lvl>
+    <w:lvl w:ilvl="6" w:tplc="0C0A0001" w:tentative="1">
+      <w:start w:val="1"/>
+      <w:numFmt w:val="bullet"/>
+      <w:lvlText w:val=""/>
+      <w:lvlJc w:val="left"/>
+      <w:pPr>
+        <w:ind w:left="5040" w:hanging="360"/>
+      </w:pPr>
+      <w:rPr>
+        <w:rFonts w:ascii="Symbol" w:hAnsi="Symbol" w:hint="default"/>
+      </w:rPr>
+    </w:lvl>
+    <w:lvl w:ilvl="7" w:tplc="0C0A0003" w:tentative="1">
+      <w:start w:val="1"/>
+      <w:numFmt w:val="bullet"/>
+      <w:lvlText w:val="o"/>
+      <w:lvlJc w:val="left"/>
+      <w:pPr>
+        <w:ind w:left="5760" w:hanging="360"/>
+      </w:pPr>
+      <w:rPr>
+        <w:rFonts w:ascii="Courier New" w:hAnsi="Courier New" w:cs="Courier New" w:hint="default"/>
+      </w:rPr>
+    </w:lvl>
+    <w:lvl w:ilvl="8" w:tplc="0C0A0005" w:tentative="1">
+      <w:start w:val="1"/>
+      <w:numFmt w:val="bullet"/>
+      <w:lvlText w:val=""/>
+      <w:lvlJc w:val="left"/>
+      <w:pPr>
+        <w:ind w:left="6480" w:hanging="360"/>
+      </w:pPr>
+      <w:rPr>
+        <w:rFonts w:ascii="Wingdings" w:hAnsi="Wingdings" w:hint="default"/>
+      </w:rPr>
+    </w:lvl>
+  </w:abstractNum>
+  <w:num w:numId="1">
+    <w:abstractNumId w:val="0"/>
+  </w:num>
+</w:numbering>
 </file>
 
 <file path=word/styles.xml><?xml version="1.0" encoding="utf-8"?>
@@ -6570,6 +6885,17 @@
       <w:u w:val="single"/>
     </w:rPr>
   </w:style>
+  <w:style w:type="paragraph" w:styleId="Prrafodelista">
+    <w:name w:val="List Paragraph"/>
+    <w:basedOn w:val="Normal"/>
+    <w:uiPriority w:val="34"/>
+    <w:qFormat/>
+    <w:rsid w:val="00BC664C"/>
+    <w:pPr>
+      <w:ind w:left="720"/>
+      <w:contextualSpacing/>
+    </w:pPr>
+  </w:style>
 </w:styles>
 </file>
 

</xml_diff>